<commit_message>
add basic ai evaluation feature
</commit_message>
<xml_diff>
--- a/Documents/3. Bao cao khoa luan.docx
+++ b/Documents/3. Bao cao khoa luan.docx
@@ -774,9 +774,20 @@
           <w:pPr>
             <w:pStyle w:val="TOCHeading"/>
             <w:spacing w:line="360" w:lineRule="auto"/>
+            <w:jc w:val="center"/>
+            <w:rPr>
+              <w:b/>
+              <w:bCs/>
+              <w:color w:val="auto"/>
+            </w:rPr>
           </w:pPr>
           <w:r>
-            <w:t>Contents</w:t>
+            <w:rPr>
+              <w:b/>
+              <w:bCs/>
+              <w:color w:val="auto"/>
+            </w:rPr>
+            <w:t>Mục lục</w:t>
           </w:r>
         </w:p>
         <w:p>
@@ -8668,6 +8679,7 @@
         <w:rPr>
           <w:b/>
           <w:bCs/>
+          <w:noProof/>
           <w:lang w:val="en-US"/>
         </w:rPr>
         <w:drawing>
@@ -8783,13 +8795,7 @@
         <w:rPr>
           <w:lang w:val="en-US"/>
         </w:rPr>
-        <w:t xml:space="preserve">- Mô tả chung: Mô tả việc người dùng đăng </w:t>
-      </w:r>
-      <w:r>
-        <w:rPr>
-          <w:lang w:val="en-US"/>
-        </w:rPr>
-        <w:t>nhập vào hệ thống</w:t>
+        <w:t>- Mô tả chung: Mô tả việc người dùng đăng nhập vào hệ thống</w:t>
       </w:r>
       <w:r>
         <w:rPr>
@@ -8886,13 +8892,7 @@
               <w:rPr>
                 <w:lang w:val="en-US"/>
               </w:rPr>
-              <w:t xml:space="preserve">1. Người dùng truy cập trang đăng </w:t>
-            </w:r>
-            <w:r>
-              <w:rPr>
-                <w:lang w:val="en-US"/>
-              </w:rPr>
-              <w:t>nhập</w:t>
+              <w:t>1. Người dùng truy cập trang đăng nhập</w:t>
             </w:r>
             <w:r>
               <w:rPr>
@@ -8924,13 +8924,7 @@
               <w:rPr>
                 <w:lang w:val="en-US"/>
               </w:rPr>
-              <w:t xml:space="preserve">3. Nhập thông tin </w:t>
-            </w:r>
-            <w:r>
-              <w:rPr>
-                <w:lang w:val="en-US"/>
-              </w:rPr>
-              <w:t>đăng nhập</w:t>
+              <w:t>3. Nhập thông tin đăng nhập</w:t>
             </w:r>
             <w:r>
               <w:rPr>
@@ -8949,13 +8943,7 @@
               <w:rPr>
                 <w:lang w:val="en-US"/>
               </w:rPr>
-              <w:t xml:space="preserve">4. Gởi thông tin đăng </w:t>
-            </w:r>
-            <w:r>
-              <w:rPr>
-                <w:lang w:val="en-US"/>
-              </w:rPr>
-              <w:t>nhập</w:t>
+              <w:t>4. Gởi thông tin đăng nhập</w:t>
             </w:r>
             <w:r>
               <w:rPr>
@@ -9025,13 +9013,7 @@
               <w:rPr>
                 <w:lang w:val="en-US"/>
               </w:rPr>
-              <w:t xml:space="preserve">2. Hiển thị form </w:t>
-            </w:r>
-            <w:r>
-              <w:rPr>
-                <w:lang w:val="en-US"/>
-              </w:rPr>
-              <w:t>đăng nhập</w:t>
+              <w:t>2. Hiển thị form đăng nhập</w:t>
             </w:r>
             <w:r>
               <w:rPr>
@@ -9076,13 +9058,7 @@
               <w:rPr>
                 <w:lang w:val="en-US"/>
               </w:rPr>
-              <w:t xml:space="preserve">5. </w:t>
-            </w:r>
-            <w:r>
-              <w:rPr>
-                <w:lang w:val="en-US"/>
-              </w:rPr>
-              <w:t>Xác thực thông tin đăng nhập, nếu đúng cho phép đăng nhập và ngược lại</w:t>
+              <w:t>5. Xác thực thông tin đăng nhập, nếu đúng cho phép đăng nhập và ngược lại</w:t>
             </w:r>
             <w:r>
               <w:rPr>
@@ -9250,6 +9226,7 @@
         <w:rPr>
           <w:b/>
           <w:bCs/>
+          <w:noProof/>
           <w:lang w:val="en-US"/>
         </w:rPr>
         <w:lastRenderedPageBreak/>
@@ -9366,13 +9343,7 @@
         <w:rPr>
           <w:lang w:val="en-US"/>
         </w:rPr>
-        <w:t xml:space="preserve">- Mô tả chung: Mô tả việc người dùng </w:t>
-      </w:r>
-      <w:r>
-        <w:rPr>
-          <w:lang w:val="en-US"/>
-        </w:rPr>
-        <w:t>thực hiện tìm kiếm việc làm</w:t>
+        <w:t>- Mô tả chung: Mô tả việc người dùng thực hiện tìm kiếm việc làm</w:t>
       </w:r>
       <w:r>
         <w:rPr>
@@ -9469,13 +9440,7 @@
               <w:rPr>
                 <w:lang w:val="en-US"/>
               </w:rPr>
-              <w:t xml:space="preserve">1. Người dùng </w:t>
-            </w:r>
-            <w:r>
-              <w:rPr>
-                <w:lang w:val="en-US"/>
-              </w:rPr>
-              <w:t>nhập nội dung tìm kiếm vào ô tìm kiếm</w:t>
+              <w:t>1. Người dùng nhập nội dung tìm kiếm vào ô tìm kiếm</w:t>
             </w:r>
             <w:r>
               <w:rPr>
@@ -9773,6 +9738,7 @@
         <w:rPr>
           <w:b/>
           <w:bCs/>
+          <w:noProof/>
           <w:lang w:val="en-US"/>
         </w:rPr>
         <w:drawing>
@@ -9831,57 +9797,50 @@
           <w:szCs w:val="26"/>
           <w:lang w:val="en-US"/>
         </w:rPr>
-        <w:t xml:space="preserve">Giúp người dùng </w:t>
+        <w:t>Giúp người dùng xem danh sách các việc làm có trong hệ thống</w:t>
+      </w:r>
+    </w:p>
+    <w:p>
+      <w:pPr>
+        <w:rPr>
+          <w:b/>
+          <w:bCs/>
+          <w:lang w:val="en-US"/>
+        </w:rPr>
+      </w:pPr>
+      <w:r>
+        <w:rPr>
+          <w:b/>
+          <w:bCs/>
+          <w:lang w:val="en-US"/>
+        </w:rPr>
+        <w:t>Tác nhân, mô tả chung:</w:t>
+      </w:r>
+    </w:p>
+    <w:p>
+      <w:pPr>
+        <w:rPr>
+          <w:lang w:val="en-US"/>
+        </w:rPr>
+      </w:pPr>
+      <w:r>
+        <w:rPr>
+          <w:lang w:val="en-US"/>
+        </w:rPr>
+        <w:t xml:space="preserve">- Tác nhân: </w:t>
       </w:r>
       <w:r>
         <w:rPr>
           <w:szCs w:val="26"/>
           <w:lang w:val="en-US"/>
         </w:rPr>
-        <w:t>xem danh sách các việc làm có trong hệ thống</w:t>
-      </w:r>
-    </w:p>
-    <w:p>
-      <w:pPr>
-        <w:rPr>
-          <w:b/>
-          <w:bCs/>
-          <w:lang w:val="en-US"/>
-        </w:rPr>
-      </w:pPr>
-      <w:r>
-        <w:rPr>
-          <w:b/>
-          <w:bCs/>
-          <w:lang w:val="en-US"/>
-        </w:rPr>
-        <w:t>Tác nhân, mô tả chung:</w:t>
-      </w:r>
-    </w:p>
-    <w:p>
-      <w:pPr>
-        <w:rPr>
-          <w:lang w:val="en-US"/>
-        </w:rPr>
-      </w:pPr>
-      <w:r>
-        <w:rPr>
-          <w:lang w:val="en-US"/>
-        </w:rPr>
-        <w:t xml:space="preserve">- Tác nhân: </w:t>
+        <w:t xml:space="preserve">Người dùng </w:t>
       </w:r>
       <w:r>
         <w:rPr>
           <w:szCs w:val="26"/>
           <w:lang w:val="en-US"/>
         </w:rPr>
-        <w:t xml:space="preserve">Người dùng </w:t>
-      </w:r>
-      <w:r>
-        <w:rPr>
-          <w:szCs w:val="26"/>
-          <w:lang w:val="en-US"/>
-        </w:rPr>
         <w:t>chưa đăng kí và đã đăng kí.</w:t>
       </w:r>
     </w:p>
@@ -9895,13 +9854,7 @@
         <w:rPr>
           <w:lang w:val="en-US"/>
         </w:rPr>
-        <w:t xml:space="preserve">- Mô tả chung: Mô tả việc người dùng thực hiện </w:t>
-      </w:r>
-      <w:r>
-        <w:rPr>
-          <w:lang w:val="en-US"/>
-        </w:rPr>
-        <w:t>xem danh sách việc làm</w:t>
+        <w:t>- Mô tả chung: Mô tả việc người dùng thực hiện xem danh sách việc làm</w:t>
       </w:r>
     </w:p>
     <w:p>
@@ -9992,13 +9945,7 @@
               <w:rPr>
                 <w:lang w:val="en-US"/>
               </w:rPr>
-              <w:t xml:space="preserve">1. Người dùng </w:t>
-            </w:r>
-            <w:r>
-              <w:rPr>
-                <w:lang w:val="en-US"/>
-              </w:rPr>
-              <w:t>truy cập trang việc làm</w:t>
+              <w:t>1. Người dùng truy cập trang việc làm</w:t>
             </w:r>
           </w:p>
           <w:p>
@@ -10202,6 +10149,7 @@
         <w:rPr>
           <w:b/>
           <w:bCs/>
+          <w:noProof/>
           <w:lang w:val="en-US"/>
         </w:rPr>
         <w:drawing>
@@ -10659,6 +10607,7 @@
         <w:rPr>
           <w:b/>
           <w:bCs/>
+          <w:noProof/>
           <w:lang w:val="en-US"/>
         </w:rPr>
         <w:lastRenderedPageBreak/>
@@ -11158,6 +11107,7 @@
         <w:rPr>
           <w:b/>
           <w:bCs/>
+          <w:noProof/>
           <w:lang w:val="en-US"/>
         </w:rPr>
         <w:lastRenderedPageBreak/>
@@ -13272,6 +13222,7 @@
   <w:style w:type="character" w:default="1" w:styleId="DefaultParagraphFont">
     <w:name w:val="Default Paragraph Font"/>
     <w:uiPriority w:val="1"/>
+    <w:semiHidden/>
     <w:unhideWhenUsed/>
   </w:style>
   <w:style w:type="table" w:default="1" w:styleId="TableNormal">

</xml_diff>